<commit_message>
docs(clinical): Akima packet addendum — encryption v2 upgrade + demographics posture ratifications
Section 1 addendum (2026-07-25): (A) encryption-method upgrade to
non-deterministic, tamper-detecting v2 across both keys (migration
20260725110000) — clinical-key scope ratification; (B) the nine decorative
twin columns dropped (20260725150000) + the ratified demographics/org-
identifier protection posture statement. DOCX regenerated via pandoc.

Co-Authored-By: Claude Fable 5 <noreply@anthropic.com>
</commit_message>
<xml_diff>
--- a/docs/clinical/AKIMA_RATIFICATION_PACKET_2026-07-23.docx
+++ b/docs/clinical/AKIMA_RATIFICATION_PACKET_2026-07-23.docx
@@ -4,14 +4,6 @@
   <w:body>
     <w:p>
       <w:pPr>
-        <w:pStyle w:val="Title"/>
-      </w:pPr>
-      <w:r>
-        <w:t xml:space="preserve">Clinical &amp; Compliance Ratification Packet — 2026-07-23</w:t>
-      </w:r>
-    </w:p>
-    <w:p>
-      <w:pPr>
         <w:pStyle w:val="Heading1"/>
       </w:pPr>
       <w:bookmarkStart w:id="20" w:name="X751366220e20f8827ec4a1fe7b5fb1a3d28a9e1"/>
@@ -35,6 +27,21 @@
       </w:r>
       <w:r>
         <w:t xml:space="preserve">2026-07-23 ·</w:t>
+      </w:r>
+      <w:r>
+        <w:t xml:space="preserve"> </w:t>
+      </w:r>
+      <w:r>
+        <w:rPr>
+          <w:b/>
+        </w:rPr>
+        <w:t xml:space="preserve">Updated:</w:t>
+      </w:r>
+      <w:r>
+        <w:t xml:space="preserve"> </w:t>
+      </w:r>
+      <w:r>
+        <w:t xml:space="preserve">2026-07-25 (Section 1 addendum — encryption) ·</w:t>
       </w:r>
       <w:r>
         <w:t xml:space="preserve"> </w:t>
@@ -472,6 +479,204 @@
       </w:r>
     </w:p>
     <w:p>
+      <w:pPr>
+        <w:pStyle w:val="Heading3"/>
+      </w:pPr>
+      <w:bookmarkStart w:id="22" w:name="X8112036a6dc3cae0f4db8b0f1c490be32aa3d93"/>
+      <w:r>
+        <w:t xml:space="preserve">Addendum 2026-07-25 — Encryption Upgrade &amp; Demographics Posture (external audit follow-up)</w:t>
+      </w:r>
+      <w:bookmarkEnd w:id="22"/>
+    </w:p>
+    <w:p>
+      <w:pPr>
+        <w:pStyle w:val="FirstParagraph"/>
+      </w:pPr>
+      <w:r>
+        <w:rPr>
+          <w:b/>
+        </w:rPr>
+        <w:t xml:space="preserve">Context.</w:t>
+      </w:r>
+      <w:r>
+        <w:t xml:space="preserve"> </w:t>
+      </w:r>
+      <w:r>
+        <w:t xml:space="preserve">An external security audit (2026-07-25) examined the encryption layer. Two changes were applied the same day under Maria’s approval; both need your ratification because they touch clinical-key scope.</w:t>
+      </w:r>
+    </w:p>
+    <w:p>
+      <w:pPr>
+        <w:pStyle w:val="BodyText"/>
+      </w:pPr>
+      <w:r>
+        <w:rPr>
+          <w:b/>
+        </w:rPr>
+        <w:t xml:space="preserve">A. Encryption method upgraded (applies to BOTH keys).</w:t>
+      </w:r>
+      <w:r>
+        <w:t xml:space="preserve"> </w:t>
+      </w:r>
+      <w:r>
+        <w:t xml:space="preserve">The mathematical method used to scramble PHI had two weaknesses: the same value always produced the same scrambled output (so two patients sharing a birth date had identical ciphertext — patterns visible without ever decrypting), and a modified ciphertext could not be detected. The method was upgraded so every encryption produces a unique result and any tampering is detected and rejected. All 14 previously-encrypted values were re-encrypted under the new method and verified against their source values. Nothing about who can encrypt/decrypt, which key covers which product, or the fail-closed behavior changed. (Migration</w:t>
+      </w:r>
+      <w:r>
+        <w:t xml:space="preserve"> </w:t>
+      </w:r>
+      <w:r>
+        <w:rPr>
+          <w:rStyle w:val="VerbatimChar"/>
+        </w:rPr>
+        <w:t xml:space="preserve">20260725110000</w:t>
+      </w:r>
+      <w:r>
+        <w:t xml:space="preserve">; procedure documented in</w:t>
+      </w:r>
+      <w:r>
+        <w:t xml:space="preserve"> </w:t>
+      </w:r>
+      <w:r>
+        <w:rPr>
+          <w:rStyle w:val="VerbatimChar"/>
+        </w:rPr>
+        <w:t xml:space="preserve">docs/compliance/PHI_ENCRYPTION_KEY_ROTATION.md</w:t>
+      </w:r>
+      <w:r>
+        <w:t xml:space="preserve">.)</w:t>
+      </w:r>
+    </w:p>
+    <w:p>
+      <w:pPr>
+        <w:pStyle w:val="Compact"/>
+        <w:numPr>
+          <w:numId w:val="1003"/>
+          <w:ilvl w:val="0"/>
+        </w:numPr>
+      </w:pPr>
+      <w:r>
+        <w:t xml:space="preserve">[ ] Ratify the encryption-method upgrade for clinical-key scope (risk assessments, handoff packets).</w:t>
+      </w:r>
+    </w:p>
+    <w:p>
+      <w:pPr>
+        <w:pStyle w:val="FirstParagraph"/>
+      </w:pPr>
+      <w:r>
+        <w:rPr>
+          <w:b/>
+        </w:rPr>
+        <w:t xml:space="preserve">B. Demographics protection posture (nine</w:t>
+      </w:r>
+      <w:r>
+        <w:rPr>
+          <w:b/>
+        </w:rPr>
+        <w:t xml:space="preserve"> </w:t>
+      </w:r>
+      <w:r>
+        <w:rPr>
+          <w:b/>
+        </w:rPr>
+        <w:t xml:space="preserve">“</w:t>
+      </w:r>
+      <w:r>
+        <w:rPr>
+          <w:b/>
+        </w:rPr>
+        <w:t xml:space="preserve">decorative</w:t>
+      </w:r>
+      <w:r>
+        <w:rPr>
+          <w:b/>
+        </w:rPr>
+        <w:t xml:space="preserve">”</w:t>
+      </w:r>
+      <w:r>
+        <w:rPr>
+          <w:b/>
+        </w:rPr>
+        <w:t xml:space="preserve"> </w:t>
+      </w:r>
+      <w:r>
+        <w:rPr>
+          <w:b/>
+        </w:rPr>
+        <w:t xml:space="preserve">columns removed).</w:t>
+      </w:r>
+      <w:r>
+        <w:t xml:space="preserve"> </w:t>
+      </w:r>
+      <w:r>
+        <w:t xml:space="preserve">The audit also found nine database columns holding an</w:t>
+      </w:r>
+      <w:r>
+        <w:t xml:space="preserve"> </w:t>
+      </w:r>
+      <w:r>
+        <w:rPr>
+          <w:i/>
+        </w:rPr>
+        <w:t xml:space="preserve">encrypted copy</w:t>
+      </w:r>
+      <w:r>
+        <w:t xml:space="preserve"> </w:t>
+      </w:r>
+      <w:r>
+        <w:t xml:space="preserve">of a value that sat</w:t>
+      </w:r>
+      <w:r>
+        <w:t xml:space="preserve"> </w:t>
+      </w:r>
+      <w:r>
+        <w:rPr>
+          <w:b/>
+        </w:rPr>
+        <w:t xml:space="preserve">unencrypted in the same row</w:t>
+      </w:r>
+      <w:r>
+        <w:t xml:space="preserve"> </w:t>
+      </w:r>
+      <w:r>
+        <w:t xml:space="preserve">(dates of birth, organization tax IDs). The encrypted copy protected nothing — anyone able to read the row read the plain value beside it — and the plain values must stay readable because identity matching (e.g., the CHW kiosk finding a senior by name + birth date) requires them. With Maria’s approval the nine duplicate columns were removed, and the protection posture for demographics and organization identifiers is now stated honestly:</w:t>
+      </w:r>
+    </w:p>
+    <w:p>
+      <w:pPr>
+        <w:pStyle w:val="BlockText"/>
+      </w:pPr>
+      <w:r>
+        <w:rPr>
+          <w:i/>
+        </w:rPr>
+        <w:t xml:space="preserve">Demographics and organization identifiers are protected by whole-database encryption at rest, tenant Row-Level Security isolation, and PHI access audit logging. Column-level encryption is reserved for high-sensitivity content that keeps no plaintext copy — risk-assessment narratives, handoff packets, and CHW kiosk photos, all of which remain fully encrypted and were untouched.</w:t>
+      </w:r>
+    </w:p>
+    <w:p>
+      <w:pPr>
+        <w:pStyle w:val="Compact"/>
+        <w:numPr>
+          <w:numId w:val="1004"/>
+          <w:ilvl w:val="0"/>
+        </w:numPr>
+      </w:pPr>
+      <w:r>
+        <w:t xml:space="preserve">[ ] Ratify the demographics/org-identifier protection posture as stated above.</w:t>
+      </w:r>
+    </w:p>
+    <w:p>
+      <w:pPr>
+        <w:pStyle w:val="Compact"/>
+        <w:numPr>
+          <w:numId w:val="1004"/>
+          <w:ilvl w:val="0"/>
+        </w:numPr>
+      </w:pPr>
+      <w:r>
+        <w:t xml:space="preserve">[ ] Awareness note: if a future customer or certification requires column-level encryption of demographics, that is a scoped project (searchable-index infrastructure) — documented as the rejected-for-now alternative in the rotation procedure file.</w:t>
+      </w:r>
+    </w:p>
+    <w:p>
       <w:r>
         <w:pict>
           <v:rect style="width:0;height:1.5pt" o:hralign="center" o:hrstd="t" o:hr="t"/>
@@ -482,11 +687,11 @@
       <w:pPr>
         <w:pStyle w:val="Heading2"/>
       </w:pPr>
-      <w:bookmarkStart w:id="22" w:name="X833e5864a935b58978b0f56007e989742a279c3"/>
+      <w:bookmarkStart w:id="23" w:name="X833e5864a935b58978b0f56007e989742a279c3"/>
       <w:r>
         <w:t xml:space="preserve">2. AI Model Version Change — Clinical Fleet on Claude Sonnet 5 (Tier-3 Ratification)</w:t>
       </w:r>
-      <w:bookmarkEnd w:id="22"/>
+      <w:bookmarkEnd w:id="23"/>
     </w:p>
     <w:p>
       <w:pPr>
@@ -577,7 +782,7 @@
       <w:pPr>
         <w:pStyle w:val="Compact"/>
         <w:numPr>
-          <w:numId w:val="1003"/>
+          <w:numId w:val="1005"/>
           <w:ilvl w:val="0"/>
         </w:numPr>
       </w:pPr>
@@ -589,7 +794,7 @@
       <w:pPr>
         <w:pStyle w:val="Compact"/>
         <w:numPr>
-          <w:numId w:val="1003"/>
+          <w:numId w:val="1005"/>
           <w:ilvl w:val="0"/>
         </w:numPr>
       </w:pPr>
@@ -616,7 +821,7 @@
       <w:pPr>
         <w:pStyle w:val="Compact"/>
         <w:numPr>
-          <w:numId w:val="1003"/>
+          <w:numId w:val="1005"/>
           <w:ilvl w:val="0"/>
         </w:numPr>
       </w:pPr>
@@ -635,11 +840,11 @@
       <w:pPr>
         <w:pStyle w:val="Heading2"/>
       </w:pPr>
-      <w:bookmarkStart w:id="23" w:name="Xe78c808420f54e0c51daa0ba2474205114f3333"/>
+      <w:bookmarkStart w:id="24" w:name="Xe78c808420f54e0c51daa0ba2474205114f3333"/>
       <w:r>
         <w:t xml:space="preserve">3. Transfer System — Two Ratifications (Applied 2026-07-22, Maria’s Judgment Calls)</w:t>
       </w:r>
-      <w:bookmarkEnd w:id="23"/>
+      <w:bookmarkEnd w:id="24"/>
     </w:p>
     <w:p>
       <w:pPr>
@@ -715,7 +920,7 @@
       <w:pPr>
         <w:pStyle w:val="Compact"/>
         <w:numPr>
-          <w:numId w:val="1004"/>
+          <w:numId w:val="1006"/>
           <w:ilvl w:val="0"/>
         </w:numPr>
       </w:pPr>
@@ -759,7 +964,7 @@
       <w:pPr>
         <w:pStyle w:val="Compact"/>
         <w:numPr>
-          <w:numId w:val="1005"/>
+          <w:numId w:val="1007"/>
           <w:ilvl w:val="0"/>
         </w:numPr>
       </w:pPr>
@@ -778,11 +983,11 @@
       <w:pPr>
         <w:pStyle w:val="Heading2"/>
       </w:pPr>
-      <w:bookmarkStart w:id="24" w:name="Xd3acb201e522722a5f9c39bc710373bc217c8db"/>
+      <w:bookmarkStart w:id="25" w:name="Xd3acb201e522722a5f9c39bc710373bc217c8db"/>
       <w:r>
         <w:t xml:space="preserve">4. Mental &amp; Behavioral Health Suite — Activation Sign-Off</w:t>
       </w:r>
-      <w:bookmarkEnd w:id="24"/>
+      <w:bookmarkEnd w:id="25"/>
     </w:p>
     <w:p>
       <w:pPr>
@@ -846,7 +1051,7 @@
       <w:pPr>
         <w:pStyle w:val="Compact"/>
         <w:numPr>
-          <w:numId w:val="1006"/>
+          <w:numId w:val="1008"/>
           <w:ilvl w:val="0"/>
         </w:numPr>
       </w:pPr>
@@ -858,7 +1063,7 @@
       <w:pPr>
         <w:pStyle w:val="Compact"/>
         <w:numPr>
-          <w:numId w:val="1006"/>
+          <w:numId w:val="1008"/>
           <w:ilvl w:val="0"/>
         </w:numPr>
       </w:pPr>
@@ -870,7 +1075,7 @@
       <w:pPr>
         <w:pStyle w:val="Compact"/>
         <w:numPr>
-          <w:numId w:val="1006"/>
+          <w:numId w:val="1008"/>
           <w:ilvl w:val="0"/>
         </w:numPr>
       </w:pPr>
@@ -882,7 +1087,7 @@
       <w:pPr>
         <w:pStyle w:val="Compact"/>
         <w:numPr>
-          <w:numId w:val="1006"/>
+          <w:numId w:val="1008"/>
           <w:ilvl w:val="0"/>
         </w:numPr>
       </w:pPr>
@@ -894,7 +1099,7 @@
       <w:pPr>
         <w:pStyle w:val="Compact"/>
         <w:numPr>
-          <w:numId w:val="1006"/>
+          <w:numId w:val="1008"/>
           <w:ilvl w:val="0"/>
         </w:numPr>
       </w:pPr>
@@ -906,7 +1111,7 @@
       <w:pPr>
         <w:pStyle w:val="Compact"/>
         <w:numPr>
-          <w:numId w:val="1006"/>
+          <w:numId w:val="1008"/>
           <w:ilvl w:val="0"/>
         </w:numPr>
       </w:pPr>
@@ -918,7 +1123,7 @@
       <w:pPr>
         <w:pStyle w:val="Compact"/>
         <w:numPr>
-          <w:numId w:val="1006"/>
+          <w:numId w:val="1008"/>
           <w:ilvl w:val="0"/>
         </w:numPr>
       </w:pPr>
@@ -930,7 +1135,7 @@
       <w:pPr>
         <w:pStyle w:val="Compact"/>
         <w:numPr>
-          <w:numId w:val="1006"/>
+          <w:numId w:val="1008"/>
           <w:ilvl w:val="0"/>
         </w:numPr>
       </w:pPr>
@@ -953,7 +1158,7 @@
       <w:pPr>
         <w:pStyle w:val="Compact"/>
         <w:numPr>
-          <w:numId w:val="1007"/>
+          <w:numId w:val="1009"/>
           <w:ilvl w:val="0"/>
         </w:numPr>
       </w:pPr>
@@ -965,7 +1170,7 @@
       <w:pPr>
         <w:pStyle w:val="Compact"/>
         <w:numPr>
-          <w:numId w:val="1007"/>
+          <w:numId w:val="1009"/>
           <w:ilvl w:val="0"/>
         </w:numPr>
       </w:pPr>
@@ -977,7 +1182,7 @@
       <w:pPr>
         <w:pStyle w:val="Compact"/>
         <w:numPr>
-          <w:numId w:val="1007"/>
+          <w:numId w:val="1009"/>
           <w:ilvl w:val="0"/>
         </w:numPr>
       </w:pPr>
@@ -989,7 +1194,7 @@
       <w:pPr>
         <w:pStyle w:val="Compact"/>
         <w:numPr>
-          <w:numId w:val="1007"/>
+          <w:numId w:val="1009"/>
           <w:ilvl w:val="0"/>
         </w:numPr>
       </w:pPr>
@@ -1008,11 +1213,11 @@
       <w:pPr>
         <w:pStyle w:val="Heading2"/>
       </w:pPr>
-      <w:bookmarkStart w:id="25" w:name="Xf96d4ad9ffe1b99f21e85bcfbbce001a864583b"/>
+      <w:bookmarkStart w:id="26" w:name="Xf96d4ad9ffe1b99f21e85bcfbbce001a864583b"/>
       <w:r>
         <w:t xml:space="preserve">5. Intake &amp; Laboratory Workflows — New Decisions (Tracker Dated 2026-07-14)</w:t>
       </w:r>
-      <w:bookmarkEnd w:id="25"/>
+      <w:bookmarkEnd w:id="26"/>
     </w:p>
     <w:p>
       <w:pPr>
@@ -1091,7 +1296,7 @@
       <w:pPr>
         <w:pStyle w:val="Compact"/>
         <w:numPr>
-          <w:numId w:val="1008"/>
+          <w:numId w:val="1010"/>
           <w:ilvl w:val="0"/>
         </w:numPr>
       </w:pPr>
@@ -1135,7 +1340,7 @@
       <w:pPr>
         <w:pStyle w:val="Compact"/>
         <w:numPr>
-          <w:numId w:val="1009"/>
+          <w:numId w:val="1011"/>
           <w:ilvl w:val="0"/>
         </w:numPr>
       </w:pPr>
@@ -1164,7 +1369,7 @@
       <w:pPr>
         <w:pStyle w:val="Compact"/>
         <w:numPr>
-          <w:numId w:val="1010"/>
+          <w:numId w:val="1012"/>
           <w:ilvl w:val="0"/>
         </w:numPr>
       </w:pPr>
@@ -1193,7 +1398,7 @@
       <w:pPr>
         <w:pStyle w:val="Compact"/>
         <w:numPr>
-          <w:numId w:val="1011"/>
+          <w:numId w:val="1013"/>
           <w:ilvl w:val="0"/>
         </w:numPr>
       </w:pPr>
@@ -1237,7 +1442,7 @@
       <w:pPr>
         <w:pStyle w:val="Compact"/>
         <w:numPr>
-          <w:numId w:val="1012"/>
+          <w:numId w:val="1014"/>
           <w:ilvl w:val="0"/>
         </w:numPr>
       </w:pPr>
@@ -1266,7 +1471,7 @@
       <w:pPr>
         <w:pStyle w:val="Compact"/>
         <w:numPr>
-          <w:numId w:val="1013"/>
+          <w:numId w:val="1015"/>
           <w:ilvl w:val="0"/>
         </w:numPr>
       </w:pPr>
@@ -1285,11 +1490,11 @@
       <w:pPr>
         <w:pStyle w:val="Heading2"/>
       </w:pPr>
-      <w:bookmarkStart w:id="26" w:name="summary-of-what-is-not-waiting-on-you"/>
+      <w:bookmarkStart w:id="27" w:name="summary-of-what-is-not-waiting-on-you"/>
       <w:r>
         <w:t xml:space="preserve">6. Summary of What Is NOT Waiting on You</w:t>
       </w:r>
-      <w:bookmarkEnd w:id="26"/>
+      <w:bookmarkEnd w:id="27"/>
     </w:p>
     <w:p>
       <w:pPr>
@@ -1841,6 +2046,12 @@
     <w:abstractNumId w:val="991"/>
   </w:num>
   <w:num w:numId="1006">
+    <w:abstractNumId w:val="991"/>
+  </w:num>
+  <w:num w:numId="1007">
+    <w:abstractNumId w:val="991"/>
+  </w:num>
+  <w:num w:numId="1008">
     <w:abstractNumId w:val="99411"/>
     <w:lvlOverride w:ilvl="0">
       <w:startOverride w:val="1"/>
@@ -1870,12 +2081,6 @@
       <w:startOverride w:val="1"/>
     </w:lvlOverride>
   </w:num>
-  <w:num w:numId="1007">
-    <w:abstractNumId w:val="991"/>
-  </w:num>
-  <w:num w:numId="1008">
-    <w:abstractNumId w:val="991"/>
-  </w:num>
   <w:num w:numId="1009">
     <w:abstractNumId w:val="991"/>
   </w:num>
@@ -1889,6 +2094,12 @@
     <w:abstractNumId w:val="991"/>
   </w:num>
   <w:num w:numId="1013">
+    <w:abstractNumId w:val="991"/>
+  </w:num>
+  <w:num w:numId="1014">
+    <w:abstractNumId w:val="991"/>
+  </w:num>
+  <w:num w:numId="1015">
     <w:abstractNumId w:val="991"/>
   </w:num>
 </w:numbering>

</xml_diff>